<commit_message>
Oakley-brand proposal and remove renewal option
- Add Oakley Real Estate Partners letterhead (header) and contact footer
- Remove the Renewal Option term row

https://claude.ai/code/session_01UVZHzzVenz48Kcaow2P3qA
</commit_message>
<xml_diff>
--- a/Proposal_3987_Moreland_Avenue_Trailco_6.8.2026.docx
+++ b/Proposal_3987_Moreland_Avenue_Trailco_6.8.2026.docx
@@ -471,46 +471,6 @@
                 <w:i w:val="0"/>
                 <w:sz w:val="22"/>
               </w:rPr>
-              <w:t>Renewal Option:</w:t>
-            </w:r>
-          </w:p>
-        </w:tc>
-        <w:tc>
-          <w:tcPr>
-            <w:tcW w:type="dxa" w:w="6532"/>
-          </w:tcPr>
-          <w:p>
-            <w:pPr>
-              <w:spacing w:after="200"/>
-            </w:pPr>
-            <w:r>
-              <w:rPr>
-                <w:rFonts w:ascii="Times New Roman" w:hAnsi="Times New Roman" w:cs="Times New Roman"/>
-                <w:b w:val="0"/>
-                <w:i w:val="0"/>
-                <w:sz w:val="22"/>
-              </w:rPr>
-              <w:t>Tenant shall have Two (2) Six (6) month options to renew the Lease at Fair Market Value with nine (9) months’ prior written notice.</w:t>
-            </w:r>
-          </w:p>
-        </w:tc>
-      </w:tr>
-      <w:tr>
-        <w:tc>
-          <w:tcPr>
-            <w:tcW w:type="dxa" w:w="2975"/>
-          </w:tcPr>
-          <w:p>
-            <w:pPr>
-              <w:spacing w:after="200"/>
-            </w:pPr>
-            <w:r>
-              <w:rPr>
-                <w:rFonts w:ascii="Times New Roman" w:hAnsi="Times New Roman" w:cs="Times New Roman"/>
-                <w:b/>
-                <w:i w:val="0"/>
-                <w:sz w:val="22"/>
-              </w:rPr>
               <w:t>Landlord Termination Right:</w:t>
             </w:r>
           </w:p>
@@ -871,13 +831,96 @@
       </w:r>
     </w:p>
     <w:sectPr>
+      <w:headerReference w:type="default" r:id="rId9"/>
+      <w:footerReference w:type="default" r:id="rId10"/>
       <w:pgSz w:w="12240" w:h="15840"/>
-      <w:pgMar w:top="1440" w:right="1440" w:bottom="1440" w:left="1440" w:header="720" w:footer="720" w:gutter="0"/>
+      <w:pgMar w:top="1944" w:right="1440" w:bottom="1440" w:left="1440" w:header="720" w:footer="576" w:gutter="0"/>
       <w:cols w:space="720"/>
       <w:docGrid w:linePitch="360"/>
     </w:sectPr>
   </w:body>
 </w:document>
+</file>
+
+<file path=word/footer1.xml><?xml version="1.0" encoding="utf-8"?>
+<w:ftr xmlns:m="http://schemas.openxmlformats.org/officeDocument/2006/math" xmlns:mc="http://schemas.openxmlformats.org/markup-compatibility/2006" xmlns:mo="http://schemas.microsoft.com/office/mac/office/2008/main" xmlns:mv="urn:schemas-microsoft-com:mac:vml" xmlns:o="urn:schemas-microsoft-com:office:office" xmlns:r="http://schemas.openxmlformats.org/officeDocument/2006/relationships" xmlns:v="urn:schemas-microsoft-com:vml" xmlns:w10="urn:schemas-microsoft-com:office:word" xmlns:w14="http://schemas.microsoft.com/office/word/2010/wordml" xmlns:w="http://schemas.openxmlformats.org/wordprocessingml/2006/main" xmlns:wne="http://schemas.microsoft.com/office/word/2006/wordml" xmlns:wp14="http://schemas.microsoft.com/office/word/2010/wordprocessingDrawing" xmlns:wp="http://schemas.openxmlformats.org/drawingml/2006/wordprocessingDrawing" xmlns:wpc="http://schemas.microsoft.com/office/word/2010/wordprocessingCanvas" xmlns:wpg="http://schemas.microsoft.com/office/word/2010/wordprocessingGroup" xmlns:wpi="http://schemas.microsoft.com/office/word/2010/wordprocessingInk" xmlns:wps="http://schemas.microsoft.com/office/word/2010/wordprocessingShape" mc:Ignorable="w14 wp14">
+  <w:p>
+    <w:pPr>
+      <w:pStyle w:val="Footer"/>
+      <w:spacing w:before="40"/>
+      <w:jc w:val="center"/>
+      <w:pBdr>
+        <w:top w:val="single" w:sz="12" w:space="4" w:color="B38E4F"/>
+      </w:pBdr>
+    </w:pPr>
+    <w:r>
+      <w:rPr>
+        <w:rFonts w:ascii="Times New Roman" w:hAnsi="Times New Roman"/>
+        <w:b w:val="0"/>
+        <w:color w:val="1F3352"/>
+        <w:sz w:val="16"/>
+        <w:rFonts w:ascii="Times New Roman" w:hAnsi="Times New Roman" w:cs="Times New Roman"/>
+        <w:spacing w:val="20"/>
+      </w:rPr>
+      <w:t>[Street Address]  ·  Atlanta, GA [Zip]  ·  [Phone]  ·  www.oakleyrep.com</w:t>
+    </w:r>
+  </w:p>
+</w:ftr>
+</file>
+
+<file path=word/header1.xml><?xml version="1.0" encoding="utf-8"?>
+<w:hdr xmlns:m="http://schemas.openxmlformats.org/officeDocument/2006/math" xmlns:mc="http://schemas.openxmlformats.org/markup-compatibility/2006" xmlns:mo="http://schemas.microsoft.com/office/mac/office/2008/main" xmlns:mv="urn:schemas-microsoft-com:mac:vml" xmlns:o="urn:schemas-microsoft-com:office:office" xmlns:r="http://schemas.openxmlformats.org/officeDocument/2006/relationships" xmlns:v="urn:schemas-microsoft-com:vml" xmlns:w10="urn:schemas-microsoft-com:office:word" xmlns:w14="http://schemas.microsoft.com/office/word/2010/wordml" xmlns:w="http://schemas.openxmlformats.org/wordprocessingml/2006/main" xmlns:wne="http://schemas.microsoft.com/office/word/2006/wordml" xmlns:wp14="http://schemas.microsoft.com/office/word/2010/wordprocessingDrawing" xmlns:wp="http://schemas.openxmlformats.org/drawingml/2006/wordprocessingDrawing" xmlns:wpc="http://schemas.microsoft.com/office/word/2010/wordprocessingCanvas" xmlns:wpg="http://schemas.microsoft.com/office/word/2010/wordprocessingGroup" xmlns:wpi="http://schemas.microsoft.com/office/word/2010/wordprocessingInk" xmlns:wps="http://schemas.microsoft.com/office/word/2010/wordprocessingShape" mc:Ignorable="w14 wp14">
+  <w:p>
+    <w:pPr>
+      <w:pStyle w:val="Header"/>
+      <w:spacing w:after="40"/>
+      <w:jc w:val="center"/>
+    </w:pPr>
+    <w:r>
+      <w:rPr>
+        <w:rFonts w:ascii="Times New Roman" w:hAnsi="Times New Roman"/>
+        <w:b/>
+        <w:color w:val="1F3352"/>
+        <w:sz w:val="40"/>
+        <w:rFonts w:ascii="Times New Roman" w:hAnsi="Times New Roman" w:cs="Times New Roman"/>
+        <w:spacing w:val="60"/>
+      </w:rPr>
+      <w:t>OAKLEY</w:t>
+    </w:r>
+    <w:r>
+      <w:rPr>
+        <w:rFonts w:ascii="Times New Roman" w:hAnsi="Times New Roman"/>
+        <w:b/>
+        <w:color w:val="B38E4F"/>
+        <w:sz w:val="40"/>
+        <w:rFonts w:ascii="Times New Roman" w:hAnsi="Times New Roman" w:cs="Times New Roman"/>
+        <w:spacing w:val="60"/>
+      </w:rPr>
+      <w:t xml:space="preserve"> REAL ESTATE PARTNERS</w:t>
+    </w:r>
+  </w:p>
+  <w:p>
+    <w:pPr>
+      <w:spacing w:after="80"/>
+      <w:jc w:val="center"/>
+      <w:pBdr>
+        <w:bottom w:val="single" w:sz="12" w:space="4" w:color="B38E4F"/>
+      </w:pBdr>
+    </w:pPr>
+    <w:r>
+      <w:rPr>
+        <w:rFonts w:ascii="Times New Roman" w:hAnsi="Times New Roman"/>
+        <w:b w:val="0"/>
+        <w:color w:val="1F3352"/>
+        <w:sz w:val="16"/>
+        <w:rFonts w:ascii="Times New Roman" w:hAnsi="Times New Roman" w:cs="Times New Roman"/>
+        <w:caps/>
+        <w:spacing w:val="80"/>
+      </w:rPr>
+      <w:t>COMMERCIAL REAL ESTATE  ·  BROKERAGE  ·  ADVISORY</w:t>
+    </w:r>
+  </w:p>
+</w:hdr>
 </file>
 
 <file path=word/numbering.xml><?xml version="1.0" encoding="utf-8"?>

</xml_diff>

<commit_message>
Apply Oakley green branding and website to proposal letterhead
- Use Oakley brand green (#14532B) for the wordmark and rules
- Add oakleyrep.com to footer; ready to swap in the real logo image

https://claude.ai/code/session_01UVZHzzVenz48Kcaow2P3qA
</commit_message>
<xml_diff>
--- a/Proposal_3987_Moreland_Avenue_Trailco_6.8.2026.docx
+++ b/Proposal_3987_Moreland_Avenue_Trailco_6.8.2026.docx
@@ -850,14 +850,14 @@
       <w:spacing w:before="40"/>
       <w:jc w:val="center"/>
       <w:pBdr>
-        <w:top w:val="single" w:sz="12" w:space="4" w:color="B38E4F"/>
+        <w:top w:val="single" w:sz="12" w:space="6" w:color="14532B"/>
       </w:pBdr>
     </w:pPr>
     <w:r>
       <w:rPr>
         <w:rFonts w:ascii="Times New Roman" w:hAnsi="Times New Roman"/>
         <w:b w:val="0"/>
-        <w:color w:val="1F3352"/>
+        <w:color w:val="14532B"/>
         <w:sz w:val="16"/>
         <w:rFonts w:ascii="Times New Roman" w:hAnsi="Times New Roman" w:cs="Times New Roman"/>
         <w:spacing w:val="20"/>
@@ -873,30 +873,18 @@
   <w:p>
     <w:pPr>
       <w:pStyle w:val="Header"/>
-      <w:spacing w:after="40"/>
+      <w:spacing w:after="80"/>
       <w:jc w:val="center"/>
     </w:pPr>
     <w:r>
       <w:rPr>
         <w:rFonts w:ascii="Times New Roman" w:hAnsi="Times New Roman"/>
         <w:b/>
-        <w:color w:val="1F3352"/>
-        <w:sz w:val="40"/>
+        <w:color w:val="14532B"/>
+        <w:sz w:val="52"/>
         <w:rFonts w:ascii="Times New Roman" w:hAnsi="Times New Roman" w:cs="Times New Roman"/>
-        <w:spacing w:val="60"/>
-      </w:rPr>
-      <w:t>OAKLEY</w:t>
-    </w:r>
-    <w:r>
-      <w:rPr>
-        <w:rFonts w:ascii="Times New Roman" w:hAnsi="Times New Roman"/>
-        <w:b/>
-        <w:color w:val="B38E4F"/>
-        <w:sz w:val="40"/>
-        <w:rFonts w:ascii="Times New Roman" w:hAnsi="Times New Roman" w:cs="Times New Roman"/>
-        <w:spacing w:val="60"/>
-      </w:rPr>
-      <w:t xml:space="preserve"> REAL ESTATE PARTNERS</w:t>
+      </w:rPr>
+      <w:t>oakley</w:t>
     </w:r>
   </w:p>
   <w:p>
@@ -904,20 +892,20 @@
       <w:spacing w:after="80"/>
       <w:jc w:val="center"/>
       <w:pBdr>
-        <w:bottom w:val="single" w:sz="12" w:space="4" w:color="B38E4F"/>
+        <w:bottom w:val="single" w:sz="12" w:space="6" w:color="14532B"/>
       </w:pBdr>
     </w:pPr>
     <w:r>
       <w:rPr>
         <w:rFonts w:ascii="Times New Roman" w:hAnsi="Times New Roman"/>
-        <w:b w:val="0"/>
-        <w:color w:val="1F3352"/>
-        <w:sz w:val="16"/>
+        <w:b/>
+        <w:color w:val="14532B"/>
+        <w:sz w:val="18"/>
         <w:rFonts w:ascii="Times New Roman" w:hAnsi="Times New Roman" w:cs="Times New Roman"/>
         <w:caps/>
-        <w:spacing w:val="80"/>
-      </w:rPr>
-      <w:t>COMMERCIAL REAL ESTATE  ·  BROKERAGE  ·  ADVISORY</w:t>
+        <w:spacing w:val="120"/>
+      </w:rPr>
+      <w:t>REAL ESTATE PARTNERS</w:t>
     </w:r>
   </w:p>
 </w:hdr>

</xml_diff>

<commit_message>
Embed Oakley logo in proposal header
Add recreated Oakley logo (green O emblem + wordmark) and embed it in the
letterhead header.

https://claude.ai/code/session_01UVZHzzVenz48Kcaow2P3qA
</commit_message>
<xml_diff>
--- a/Proposal_3987_Moreland_Avenue_Trailco_6.8.2026.docx
+++ b/Proposal_3987_Moreland_Avenue_Trailco_6.8.2026.docx
@@ -875,37 +875,43 @@
       <w:pStyle w:val="Header"/>
       <w:spacing w:after="80"/>
       <w:jc w:val="center"/>
-    </w:pPr>
-    <w:r>
-      <w:rPr>
-        <w:rFonts w:ascii="Times New Roman" w:hAnsi="Times New Roman"/>
-        <w:b/>
-        <w:color w:val="14532B"/>
-        <w:sz w:val="52"/>
-        <w:rFonts w:ascii="Times New Roman" w:hAnsi="Times New Roman" w:cs="Times New Roman"/>
-      </w:rPr>
-      <w:t>oakley</w:t>
-    </w:r>
-  </w:p>
-  <w:p>
-    <w:pPr>
-      <w:spacing w:after="80"/>
-      <w:jc w:val="center"/>
       <w:pBdr>
         <w:bottom w:val="single" w:sz="12" w:space="6" w:color="14532B"/>
       </w:pBdr>
     </w:pPr>
     <w:r>
-      <w:rPr>
-        <w:rFonts w:ascii="Times New Roman" w:hAnsi="Times New Roman"/>
-        <w:b/>
-        <w:color w:val="14532B"/>
-        <w:sz w:val="18"/>
-        <w:rFonts w:ascii="Times New Roman" w:hAnsi="Times New Roman" w:cs="Times New Roman"/>
-        <w:caps/>
-        <w:spacing w:val="120"/>
-      </w:rPr>
-      <w:t>REAL ESTATE PARTNERS</w:t>
+      <w:drawing>
+        <wp:inline xmlns:a="http://schemas.openxmlformats.org/drawingml/2006/main" xmlns:pic="http://schemas.openxmlformats.org/drawingml/2006/picture">
+          <wp:extent cx="2377440" cy="709660"/>
+          <wp:docPr id="1" name="Picture 1"/>
+          <wp:cNvGraphicFramePr>
+            <a:graphicFrameLocks noChangeAspect="1"/>
+          </wp:cNvGraphicFramePr>
+          <a:graphic>
+            <a:graphicData uri="http://schemas.openxmlformats.org/drawingml/2006/picture">
+              <pic:pic>
+                <pic:nvPicPr>
+                  <pic:cNvPr id="0" name="oakley_logo.png"/>
+                  <pic:cNvPicPr/>
+                </pic:nvPicPr>
+                <pic:blipFill>
+                  <a:blip r:embed="rId1"/>
+                  <a:stretch>
+                    <a:fillRect/>
+                  </a:stretch>
+                </pic:blipFill>
+                <pic:spPr>
+                  <a:xfrm>
+                    <a:off x="0" y="0"/>
+                    <a:ext cx="2377440" cy="709660"/>
+                  </a:xfrm>
+                  <a:prstGeom prst="rect"/>
+                </pic:spPr>
+              </pic:pic>
+            </a:graphicData>
+          </a:graphic>
+        </wp:inline>
+      </w:drawing>
     </w:r>
   </w:p>
 </w:hdr>

</xml_diff>

<commit_message>
Use real Oakley logo and actual 3987 Moreland property data
- Replace approximated logo with the real Oakley mark (extracted from the
  property flyer artwork, recolored to brand green)
- Fill in address (Conley, GA 30288), premises (±16,000 SF: ±14,750 shop /
  ±1,250 office) on 11.27 acres
- Add property aerial photo as Exhibit A

https://claude.ai/code/session_01UVZHzzVenz48Kcaow2P3qA
</commit_message>
<xml_diff>
--- a/Proposal_3987_Moreland_Avenue_Trailco_6.8.2026.docx
+++ b/Proposal_3987_Moreland_Avenue_Trailco_6.8.2026.docx
@@ -76,7 +76,7 @@
                 <w:i w:val="0"/>
                 <w:sz w:val="22"/>
               </w:rPr>
-              <w:t>3987 Moreland Avenue, [City], GA [Zip Code]</w:t>
+              <w:t>3987 Moreland Avenue, Conley, GA 30288</w:t>
             </w:r>
           </w:p>
         </w:tc>
@@ -196,7 +196,7 @@
                 <w:i w:val="0"/>
                 <w:sz w:val="22"/>
               </w:rPr>
-              <w:t>Approximately [—] Square Feet located at 3987 Moreland Avenue (See Exhibit A)</w:t>
+              <w:t>Approximately 16,000 Square Feet (±14,750 SF shop / ±1,250 SF office) on 11.27 Acres located at 3987 Moreland Avenue, Conley, GA 30288 (See Exhibit A)</w:t>
             </w:r>
           </w:p>
         </w:tc>
@@ -818,16 +818,55 @@
     </w:p>
     <w:p>
       <w:pPr>
-        <w:spacing w:after="120" w:before="0"/>
+        <w:jc w:val="center"/>
+      </w:pPr>
+      <w:r>
+        <w:drawing>
+          <wp:inline xmlns:a="http://schemas.openxmlformats.org/drawingml/2006/main" xmlns:pic="http://schemas.openxmlformats.org/drawingml/2006/picture">
+            <wp:extent cx="5486400" cy="3086100"/>
+            <wp:docPr id="1" name="Picture 1"/>
+            <wp:cNvGraphicFramePr>
+              <a:graphicFrameLocks noChangeAspect="1"/>
+            </wp:cNvGraphicFramePr>
+            <a:graphic>
+              <a:graphicData uri="http://schemas.openxmlformats.org/drawingml/2006/picture">
+                <pic:pic>
+                  <pic:nvPicPr>
+                    <pic:cNvPr id="0" name="exhibit_a_property.png"/>
+                    <pic:cNvPicPr/>
+                  </pic:nvPicPr>
+                  <pic:blipFill>
+                    <a:blip r:embed="rId11"/>
+                    <a:stretch>
+                      <a:fillRect/>
+                    </a:stretch>
+                  </pic:blipFill>
+                  <pic:spPr>
+                    <a:xfrm>
+                      <a:off x="0" y="0"/>
+                      <a:ext cx="5486400" cy="3086100"/>
+                    </a:xfrm>
+                    <a:prstGeom prst="rect"/>
+                  </pic:spPr>
+                </pic:pic>
+              </a:graphicData>
+            </a:graphic>
+          </wp:inline>
+        </w:drawing>
+      </w:r>
+    </w:p>
+    <w:p>
+      <w:pPr>
+        <w:jc w:val="center"/>
       </w:pPr>
       <w:r>
         <w:rPr>
           <w:rFonts w:ascii="Times New Roman" w:hAnsi="Times New Roman" w:cs="Times New Roman"/>
           <w:b w:val="0"/>
           <w:i/>
-          <w:sz w:val="22"/>
+          <w:sz w:val="20"/>
         </w:rPr>
-        <w:t>[Insert Exhibit A — Premises site plan / aerial photo for 3987 Moreland Avenue]</w:t>
+        <w:t>3987 Moreland Avenue, Conley, GA 30288</w:t>
       </w:r>
     </w:p>
     <w:sectPr>
@@ -882,7 +921,7 @@
     <w:r>
       <w:drawing>
         <wp:inline xmlns:a="http://schemas.openxmlformats.org/drawingml/2006/main" xmlns:pic="http://schemas.openxmlformats.org/drawingml/2006/picture">
-          <wp:extent cx="2377440" cy="709660"/>
+          <wp:extent cx="2377440" cy="697000"/>
           <wp:docPr id="1" name="Picture 1"/>
           <wp:cNvGraphicFramePr>
             <a:graphicFrameLocks noChangeAspect="1"/>
@@ -903,7 +942,7 @@
                 <pic:spPr>
                   <a:xfrm>
                     <a:off x="0" y="0"/>
-                    <a:ext cx="2377440" cy="709660"/>
+                    <a:ext cx="2377440" cy="697000"/>
                   </a:xfrm>
                   <a:prstGeom prst="rect"/>
                 </pic:spPr>

</xml_diff>